<commit_message>
v1.1: Reestructuración completa Documento 1 + alcance confirmado sin paraderos/EtB
- Documento 1: 272KB, 23 fichas técnicas reales por componente
  (CC-SRC-01..02, CC-SGCF-01..05, CC-SST-01, CC-SIU-01, CC-COM-01..02,
   CC-CCO-01..12) con ET, RF, RNF, KPIs reales
- Documento 2: Actualizado v1.1 - paraderos reclasificados como fuera de alcance
- Documento 3: Actualizado v1.1 - alcance exacto confirmado:
  INCLUIDO: buses + CCO + conectividad
  EXCLUIDO: paraderos + EtB
- Todos los documentos en MD + DOCX
</commit_message>
<xml_diff>
--- a/PROYECTO-004-2026-SETP-SINCELEJO/05-ENTREGABLES/E2-Hallazgos-Inconsistencias/PROYECTO-004-SETP-SINCELEJO-DOCUMENTO-2-HALLAZGOS.docx
+++ b/PROYECTO-004-2026-SETP-SINCELEJO/05-ENTREGABLES/E2-Hallazgos-Inconsistencias/PROYECTO-004-SETP-SINCELEJO-DOCUMENTO-2-HALLAZGOS.docx
@@ -2,32 +2,6 @@
 <file path=word/document.xml><?xml version="1.0" encoding="utf-8"?>
 <w:document xmlns:w="http://schemas.openxmlformats.org/wordprocessingml/2006/main" xmlns:m="http://schemas.openxmlformats.org/officeDocument/2006/math" xmlns:r="http://schemas.openxmlformats.org/officeDocument/2006/relationships" xmlns:o="urn:schemas-microsoft-com:office:office" xmlns:v="urn:schemas-microsoft-com:vml" xmlns:w10="urn:schemas-microsoft-com:office:word" xmlns:a="http://schemas.openxmlformats.org/drawingml/2006/main" xmlns:pic="http://schemas.openxmlformats.org/drawingml/2006/picture" xmlns:wp="http://schemas.openxmlformats.org/drawingml/2006/wordprocessingDrawing">
   <w:body>
-    <w:sdt>
-      <w:sdtPr>
-        <w:docPartObj>
-          <w:docPartGallery w:val="Table of Contents"/>
-          <w:docPartUnique/>
-        </w:docPartObj>
-      </w:sdtPr>
-      <w:sdtContent>
-        <w:p>
-          <w:pPr>
-            <w:pStyle w:val="TOCHeading"/>
-          </w:pPr>
-          <w:r>
-            <w:t xml:space="preserve">Table of Contents</w:t>
-          </w:r>
-        </w:p>
-        <w:p>
-          <w:r>
-            <w:fldChar w:fldCharType="begin" w:dirty="true"/>
-            <w:instrText xml:space="preserve">TOC \o "1-3" \h \z \u</w:instrText>
-            <w:fldChar w:fldCharType="separate"/>
-            <w:fldChar w:fldCharType="end"/>
-          </w:r>
-        </w:p>
-      </w:sdtContent>
-    </w:sdt>
     <w:bookmarkStart w:id="64" w:name="proyecto-004-2026-setp-sincelejo"/>
     <w:p>
       <w:pPr>
@@ -77,7 +51,7 @@
         <w:t xml:space="preserve"> </w:t>
       </w:r>
       <w:r>
-        <w:t xml:space="preserve">1.0</w:t>
+        <w:t xml:space="preserve">1.1</w:t>
       </w:r>
       <w:r>
         <w:br/>
@@ -142,6 +116,55 @@
       </w:r>
       <w:r>
         <w:t xml:space="preserve">CONFIDENCIAL — USO INTERNO</w:t>
+      </w:r>
+    </w:p>
+    <w:p>
+      <w:pPr>
+        <w:pStyle w:val="BlockText"/>
+      </w:pPr>
+      <w:r>
+        <w:rPr>
+          <w:bCs/>
+          <w:b/>
+        </w:rPr>
+        <w:t xml:space="preserve">Nota de Alcance Confirmado (v1.1):</w:t>
+      </w:r>
+      <w:r>
+        <w:t xml:space="preserve"> </w:t>
+      </w:r>
+      <w:r>
+        <w:t xml:space="preserve">Este documento analiza el componente tecnológico ITS del SETP Sincelejo. Tras validación con el cliente, se confirma que</w:t>
+      </w:r>
+      <w:r>
+        <w:t xml:space="preserve"> </w:t>
+      </w:r>
+      <w:r>
+        <w:rPr>
+          <w:bCs/>
+          <w:b/>
+        </w:rPr>
+        <w:t xml:space="preserve">paraderos y EtB (Empresa de Telecomunicaciones de Bogotá) están FUERA del alcance de este proyecto de estructuración técnica</w:t>
+      </w:r>
+      <w:r>
+        <w:t xml:space="preserve">. El alcance se limita estrictamente a: equipamiento embarcado en buses, Centro de Control de Operaciones (CCO), y conectividad de red. Toda mención a paraderos en la documentación revisada se registra como hallazgo de</w:t>
+      </w:r>
+      <w:r>
+        <w:t xml:space="preserve"> </w:t>
+      </w:r>
+      <w:r>
+        <w:t xml:space="preserve">“</w:t>
+      </w:r>
+      <w:r>
+        <w:t xml:space="preserve">fuera de alcance actual</w:t>
+      </w:r>
+      <w:r>
+        <w:t xml:space="preserve">”</w:t>
+      </w:r>
+      <w:r>
+        <w:t xml:space="preserve"> </w:t>
+      </w:r>
+      <w:r>
+        <w:t xml:space="preserve">para proyectos futuros.</w:t>
       </w:r>
     </w:p>
     <w:p>
@@ -1580,6 +1603,55 @@
           <w:bCs/>
           <w:b/>
         </w:rPr>
+        <w:t xml:space="preserve">Nota de Alcance (v1.1):</w:t>
+      </w:r>
+      <w:r>
+        <w:t xml:space="preserve"> </w:t>
+      </w:r>
+      <w:r>
+        <w:t xml:space="preserve">La plantilla original incluía una línea de</w:t>
+      </w:r>
+      <w:r>
+        <w:t xml:space="preserve"> </w:t>
+      </w:r>
+      <w:r>
+        <w:t xml:space="preserve">“</w:t>
+      </w:r>
+      <w:r>
+        <w:t xml:space="preserve">Pantalla LED Paradero</w:t>
+      </w:r>
+      <w:r>
+        <w:t xml:space="preserve">”</w:t>
+      </w:r>
+      <w:r>
+        <w:t xml:space="preserve"> </w:t>
+      </w:r>
+      <w:r>
+        <w:t xml:space="preserve">con 40 unidades a $0. Dado que</w:t>
+      </w:r>
+      <w:r>
+        <w:t xml:space="preserve"> </w:t>
+      </w:r>
+      <w:r>
+        <w:rPr>
+          <w:bCs/>
+          <w:b/>
+        </w:rPr>
+        <w:t xml:space="preserve">los paraderos están fuera del alcance de este proyecto</w:t>
+      </w:r>
+      <w:r>
+        <w:t xml:space="preserve">, este ítem se elimina del análisis del componente ITS. El presupuesto ITS a diligenciar cubre exclusivamente: equipamiento embarcado en 34 buses, CCO, y conectividad de red.</w:t>
+      </w:r>
+    </w:p>
+    <w:p>
+      <w:pPr>
+        <w:pStyle w:val="BodyText"/>
+      </w:pPr>
+      <w:r>
+        <w:rPr>
+          <w:bCs/>
+          <w:b/>
+        </w:rPr>
         <w:t xml:space="preserve">Evidencia:</w:t>
       </w:r>
     </w:p>
@@ -1618,7 +1690,7 @@
         <w:rPr>
           <w:rStyle w:val="VerbatimChar"/>
         </w:rPr>
-        <w:t xml:space="preserve">Pantalla LED Paradero| 40      | Und    | $0         | $0</w:t>
+        <w:t xml:space="preserve">Router 4G Bus       | 34       | Und    | $0         | $0</w:t>
       </w:r>
       <w:r>
         <w:br/>
@@ -1627,16 +1699,7 @@
         <w:rPr>
           <w:rStyle w:val="VerbatimChar"/>
         </w:rPr>
-        <w:t xml:space="preserve">Router 4G Bus       | 34       | Und    | $0         | $0</w:t>
-      </w:r>
-      <w:r>
-        <w:br/>
-      </w:r>
-      <w:r>
-        <w:rPr>
-          <w:rStyle w:val="VerbatimChar"/>
-        </w:rPr>
-        <w:t xml:space="preserve">CCTV Interior Bus   | 136      | Und    | $0         | $0</w:t>
+        <w:t xml:space="preserve">CCTV Interior Bus   | 68       | Und    | $0         | $0</w:t>
       </w:r>
       <w:r>
         <w:br/>
@@ -2000,7 +2063,7 @@
         <w:t xml:space="preserve"> </w:t>
       </w:r>
       <w:r>
-        <w:t xml:space="preserve">Emitir adenda al RFI de buses incluyendo especificaciones de preparación para ITS.</w:t>
+        <w:t xml:space="preserve">Emitir adenda al RFI de buses incluyendo especificaciones de preparación para ITS embarcado.</w:t>
       </w:r>
     </w:p>
     <w:p>
@@ -2201,13 +2264,13 @@
       </w:r>
     </w:p>
     <w:bookmarkEnd w:id="32"/>
-    <w:bookmarkStart w:id="33" w:name="ic-07-no-se-define-cantidad-de-paraderos"/>
+    <w:bookmarkStart w:id="33" w:name="X126cdbd6ccb78bf0f5dff141e9a8372e71b93b7"/>
     <w:p>
       <w:pPr>
         <w:pStyle w:val="Heading3"/>
       </w:pPr>
       <w:r>
-        <w:t xml:space="preserve">IC-07: No Se Define Cantidad de Paraderos</w:t>
+        <w:t xml:space="preserve">IC-07: Paraderos — Fuera de Alcance Actual (No Inconsistencia Crítica)</w:t>
       </w:r>
     </w:p>
     <w:p>
@@ -2219,37 +2282,23 @@
           <w:bCs/>
           <w:b/>
         </w:rPr>
-        <w:t xml:space="preserve">Hallazgo:</w:t>
-      </w:r>
-      <w:r>
-        <w:t xml:space="preserve"> </w:t>
-      </w:r>
-      <w:r>
-        <w:t xml:space="preserve">Ningún documento establece:</w:t>
-      </w:r>
-      <w:r>
-        <w:t xml:space="preserve"> </w:t>
-      </w:r>
-      <w:r>
-        <w:t xml:space="preserve">- Número exacto de paraderos</w:t>
-      </w:r>
-      <w:r>
-        <w:t xml:space="preserve"> </w:t>
-      </w:r>
-      <w:r>
-        <w:t xml:space="preserve">- Tipología (básico, intermedio, terminal)</w:t>
-      </w:r>
-      <w:r>
-        <w:t xml:space="preserve"> </w:t>
-      </w:r>
-      <w:r>
-        <w:t xml:space="preserve">- Ubicaciones específicas</w:t>
-      </w:r>
-      <w:r>
-        <w:t xml:space="preserve"> </w:t>
-      </w:r>
-      <w:r>
-        <w:t xml:space="preserve">- Equipamiento por tipo</w:t>
+        <w:t xml:space="preserve">Estado:</w:t>
+      </w:r>
+      <w:r>
+        <w:t xml:space="preserve"> </w:t>
+      </w:r>
+      <w:r>
+        <w:t xml:space="preserve">✅</w:t>
+      </w:r>
+      <w:r>
+        <w:t xml:space="preserve"> </w:t>
+      </w:r>
+      <w:r>
+        <w:rPr>
+          <w:bCs/>
+          <w:b/>
+        </w:rPr>
+        <w:t xml:space="preserve">Validado con cliente — Paraderos fuera de alcance de este proyecto</w:t>
       </w:r>
     </w:p>
     <w:p>
@@ -2261,13 +2310,62 @@
           <w:bCs/>
           <w:b/>
         </w:rPr>
+        <w:t xml:space="preserve">Hallazgo original:</w:t>
+      </w:r>
+      <w:r>
+        <w:t xml:space="preserve"> </w:t>
+      </w:r>
+      <w:r>
+        <w:t xml:space="preserve">La documentación no define número exacto de paraderos, tipología, ni equipamiento.</w:t>
+      </w:r>
+    </w:p>
+    <w:p>
+      <w:pPr>
+        <w:pStyle w:val="BodyText"/>
+      </w:pPr>
+      <w:r>
+        <w:rPr>
+          <w:bCs/>
+          <w:b/>
+        </w:rPr>
+        <w:t xml:space="preserve">Resolución:</w:t>
+      </w:r>
+      <w:r>
+        <w:t xml:space="preserve"> </w:t>
+      </w:r>
+      <w:r>
+        <w:t xml:space="preserve">METRO SABANAS ha confirmado que el componente de paraderos (pantallas LED, alimentación, protección) será abordado en una fase posterior del proyecto, NO en esta estructuración del componente ITS. Por tanto, este ítem se reclasifica como</w:t>
+      </w:r>
+      <w:r>
+        <w:t xml:space="preserve"> </w:t>
+      </w:r>
+      <w:r>
+        <w:rPr>
+          <w:bCs/>
+          <w:b/>
+        </w:rPr>
+        <w:t xml:space="preserve">hallazgo de alcance futuro</w:t>
+      </w:r>
+      <w:r>
+        <w:t xml:space="preserve">, no como inconsistencia crítica.</w:t>
+      </w:r>
+    </w:p>
+    <w:p>
+      <w:pPr>
+        <w:pStyle w:val="BodyText"/>
+      </w:pPr>
+      <w:r>
+        <w:rPr>
+          <w:bCs/>
+          <w:b/>
+        </w:rPr>
         <w:t xml:space="preserve">Impacto:</w:t>
       </w:r>
       <w:r>
         <w:t xml:space="preserve"> </w:t>
       </w:r>
       <w:r>
-        <w:t xml:space="preserve">No se puede dimensionar sistema de información a usuarios ni estimar inversión.</w:t>
+        <w:t xml:space="preserve">Ninguno para el alcance actual. Los paraderos no requieren definición técnica en este entregable.</w:t>
       </w:r>
     </w:p>
     <w:p>
@@ -2285,7 +2383,7 @@
         <w:t xml:space="preserve"> </w:t>
       </w:r>
       <w:r>
-        <w:t xml:space="preserve">Realizar estudio de demanda y ubicación de paraderos.</w:t>
+        <w:t xml:space="preserve">Mantener registro en backlog de proyecto para fase de infraestructura de paraderos.</w:t>
       </w:r>
     </w:p>
     <w:p>
@@ -2662,13 +2760,13 @@
       </w:r>
     </w:p>
     <w:bookmarkEnd w:id="38"/>
-    <w:bookmarkStart w:id="39" w:name="X7cbecc934c9021003e10060e17f4d14492a5875"/>
+    <w:bookmarkStart w:id="39" w:name="Xd982408f6e14437fb9328376c734b8995d0f90b"/>
     <w:p>
       <w:pPr>
         <w:pStyle w:val="Heading3"/>
       </w:pPr>
       <w:r>
-        <w:t xml:space="preserve">VE-04: Sin Especificaciones de Paraderos Inteligentes</w:t>
+        <w:t xml:space="preserve">VE-04: Paraderos Inteligentes — Fuera de Alcance Actual</w:t>
       </w:r>
     </w:p>
     <w:p>
@@ -2680,37 +2778,23 @@
           <w:bCs/>
           <w:b/>
         </w:rPr>
-        <w:t xml:space="preserve">Hallazgo:</w:t>
-      </w:r>
-      <w:r>
-        <w:t xml:space="preserve"> </w:t>
-      </w:r>
-      <w:r>
-        <w:t xml:space="preserve">No hay diseño de:</w:t>
-      </w:r>
-      <w:r>
-        <w:t xml:space="preserve"> </w:t>
-      </w:r>
-      <w:r>
-        <w:t xml:space="preserve">- Tipologías de paradero</w:t>
-      </w:r>
-      <w:r>
-        <w:t xml:space="preserve"> </w:t>
-      </w:r>
-      <w:r>
-        <w:t xml:space="preserve">- Pantallas LED</w:t>
-      </w:r>
-      <w:r>
-        <w:t xml:space="preserve"> </w:t>
-      </w:r>
-      <w:r>
-        <w:t xml:space="preserve">- Sistema de alimentación (solar/eléctrica)</w:t>
-      </w:r>
-      <w:r>
-        <w:t xml:space="preserve"> </w:t>
-      </w:r>
-      <w:r>
-        <w:t xml:space="preserve">- Protección anti-vandalismo</w:t>
+        <w:t xml:space="preserve">Estado:</w:t>
+      </w:r>
+      <w:r>
+        <w:t xml:space="preserve"> </w:t>
+      </w:r>
+      <w:r>
+        <w:t xml:space="preserve">✅</w:t>
+      </w:r>
+      <w:r>
+        <w:t xml:space="preserve"> </w:t>
+      </w:r>
+      <w:r>
+        <w:rPr>
+          <w:bCs/>
+          <w:b/>
+        </w:rPr>
+        <w:t xml:space="preserve">Validado con cliente — Paraderos fuera de alcance de este proyecto</w:t>
       </w:r>
     </w:p>
     <w:p>
@@ -2722,13 +2806,83 @@
           <w:bCs/>
           <w:b/>
         </w:rPr>
+        <w:t xml:space="preserve">Hallazgo original:</w:t>
+      </w:r>
+      <w:r>
+        <w:t xml:space="preserve"> </w:t>
+      </w:r>
+      <w:r>
+        <w:t xml:space="preserve">No hay diseño de paraderos inteligentes (tipologías, pantallas LED, alimentación, protección anti-vandalismo).</w:t>
+      </w:r>
+    </w:p>
+    <w:p>
+      <w:pPr>
+        <w:pStyle w:val="BodyText"/>
+      </w:pPr>
+      <w:r>
+        <w:rPr>
+          <w:bCs/>
+          <w:b/>
+        </w:rPr>
+        <w:t xml:space="preserve">Resolución:</w:t>
+      </w:r>
+      <w:r>
+        <w:t xml:space="preserve"> </w:t>
+      </w:r>
+      <w:r>
+        <w:t xml:space="preserve">Este vacío es</w:t>
+      </w:r>
+      <w:r>
+        <w:t xml:space="preserve"> </w:t>
+      </w:r>
+      <w:r>
+        <w:rPr>
+          <w:bCs/>
+          <w:b/>
+        </w:rPr>
+        <w:t xml:space="preserve">esperado y aceptado</w:t>
+      </w:r>
+      <w:r>
+        <w:t xml:space="preserve"> </w:t>
+      </w:r>
+      <w:r>
+        <w:t xml:space="preserve">dado que el alcance del proyecto se limita al componente tecnológico embarcado (buses + CCO + conectividad). Los paraderos serán diseñados en fase posterior de infraestructura física.</w:t>
+      </w:r>
+    </w:p>
+    <w:p>
+      <w:pPr>
+        <w:pStyle w:val="BodyText"/>
+      </w:pPr>
+      <w:r>
+        <w:rPr>
+          <w:bCs/>
+          <w:b/>
+        </w:rPr>
         <w:t xml:space="preserve">Impacto:</w:t>
       </w:r>
       <w:r>
         <w:t xml:space="preserve"> </w:t>
       </w:r>
       <w:r>
-        <w:t xml:space="preserve">Los paraderos podrían no cumplir función informativa.</w:t>
+        <w:t xml:space="preserve">Ninguno para el alcance actual. No se requieren especificaciones de paradero en este entregable.</w:t>
+      </w:r>
+    </w:p>
+    <w:p>
+      <w:pPr>
+        <w:pStyle w:val="BodyText"/>
+      </w:pPr>
+      <w:r>
+        <w:rPr>
+          <w:bCs/>
+          <w:b/>
+        </w:rPr>
+        <w:t xml:space="preserve">Nota:</w:t>
+      </w:r>
+      <w:r>
+        <w:t xml:space="preserve"> </w:t>
+      </w:r>
+      <w:r>
+        <w:t xml:space="preserve">Las pantallas LED de paraderos que aparecían en el presupuesto ITS original ($0) se eliminan del presupuesto del componente ITS. Se estiman ~40 paraderos para referencia operativa, pero sin equipamiento ITS asignado en este proyecto.</w:t>
       </w:r>
     </w:p>
     <w:p>
@@ -4205,7 +4359,7 @@
     <w:tbl>
       <w:tblPr>
         <w:tblStyle w:val="Table"/>
-        <w:tblW w:type="auto" w:w="0"/>
+        <w:tblW w:type="pct" w:w="5000"/>
         <w:tblLook w:firstRow="1" w:lastRow="0" w:firstColumn="0" w:lastColumn="0" w:noHBand="0" w:noVBand="0" w:val="0020"/>
         <w:jc w:val="start"/>
       </w:tblPr>
@@ -4401,31 +4555,31 @@
               <w:jc w:val="left"/>
             </w:pPr>
             <w:r>
-              <w:t xml:space="preserve">204 unidades</w:t>
-            </w:r>
-          </w:p>
-        </w:tc>
-        <w:tc>
-          <w:tcPr/>
-          <w:p>
-            <w:pPr>
-              <w:pStyle w:val="Compact"/>
-              <w:jc w:val="left"/>
-            </w:pPr>
-            <w:r>
-              <w:t xml:space="preserve">450 unidades</w:t>
-            </w:r>
-          </w:p>
-        </w:tc>
-        <w:tc>
-          <w:tcPr/>
-          <w:p>
-            <w:pPr>
-              <w:pStyle w:val="Compact"/>
-              <w:jc w:val="left"/>
-            </w:pPr>
-            <w:r>
-              <w:t xml:space="preserve">+246</w:t>
+              <w:t xml:space="preserve">68 unidades (2/bus)</w:t>
+            </w:r>
+          </w:p>
+        </w:tc>
+        <w:tc>
+          <w:tcPr/>
+          <w:p>
+            <w:pPr>
+              <w:pStyle w:val="Compact"/>
+              <w:jc w:val="left"/>
+            </w:pPr>
+            <w:r>
+              <w:t xml:space="preserve">150 unidades (2/bus)</w:t>
+            </w:r>
+          </w:p>
+        </w:tc>
+        <w:tc>
+          <w:tcPr/>
+          <w:p>
+            <w:pPr>
+              <w:pStyle w:val="Compact"/>
+              <w:jc w:val="left"/>
+            </w:pPr>
+            <w:r>
+              <w:t xml:space="preserve">+82</w:t>
             </w:r>
           </w:p>
         </w:tc>
@@ -4751,7 +4905,7 @@
         <w:rPr>
           <w:rStyle w:val="VerbatimChar"/>
         </w:rPr>
-        <w:t xml:space="preserve">├─ Antena GPS                       | 34 | Und | $0 | $0</w:t>
+        <w:t xml:space="preserve">├─ Antena GPS                         | 34 | Und | $0 | $0</w:t>
       </w:r>
       <w:r>
         <w:br/>
@@ -4760,7 +4914,7 @@
         <w:rPr>
           <w:rStyle w:val="VerbatimChar"/>
         </w:rPr>
-        <w:t xml:space="preserve">├─ Tablet conductor                 | 34 | Und | $0 | $0</w:t>
+        <w:t xml:space="preserve">├─ Tablet conductor                   | 34 | Und | $0 | $0</w:t>
       </w:r>
       <w:r>
         <w:br/>
@@ -4769,7 +4923,7 @@
         <w:rPr>
           <w:rStyle w:val="VerbatimChar"/>
         </w:rPr>
-        <w:t xml:space="preserve">├─ Software SRC                     | 1  | Lic | $0 | $0</w:t>
+        <w:t xml:space="preserve">├─ Software SRC                       | 1  | Lic | $0 | $0</w:t>
       </w:r>
       <w:r>
         <w:br/>
@@ -4790,7 +4944,7 @@
         <w:rPr>
           <w:rStyle w:val="VerbatimChar"/>
         </w:rPr>
-        <w:t xml:space="preserve">├─ Validador NFC                    | 68 | Und | $0 | $0</w:t>
+        <w:t xml:space="preserve">├─ Validador NFC                      | 68 | Und | $0 | $0</w:t>
       </w:r>
       <w:r>
         <w:br/>
@@ -4799,7 +4953,7 @@
         <w:rPr>
           <w:rStyle w:val="VerbatimChar"/>
         </w:rPr>
-        <w:t xml:space="preserve">├─ Impresora térmica              | 34 | Und | $0 | $0</w:t>
+        <w:t xml:space="preserve">├─ Impresora térmica                | 34 | Und | $0 | $0</w:t>
       </w:r>
       <w:r>
         <w:br/>
@@ -4808,7 +4962,7 @@
         <w:rPr>
           <w:rStyle w:val="VerbatimChar"/>
         </w:rPr>
-        <w:t xml:space="preserve">├─ Software SGCF                    | 1  | Lic | $0 | $0</w:t>
+        <w:t xml:space="preserve">├─ Software SGCF                      | 1  | Lic | $0 | $0</w:t>
       </w:r>
       <w:r>
         <w:br/>
@@ -4829,7 +4983,7 @@
         <w:rPr>
           <w:rStyle w:val="VerbatimChar"/>
         </w:rPr>
-        <w:t xml:space="preserve">├─ Pantalla LED paradero           | 40 | Und | $0 | $0</w:t>
+        <w:t xml:space="preserve">├─ Router WiFi 4G/5G Bus              | 34 | Und | $0 | $0</w:t>
       </w:r>
       <w:r>
         <w:br/>
@@ -4838,15 +4992,24 @@
         <w:rPr>
           <w:rStyle w:val="VerbatimChar"/>
         </w:rPr>
-        <w:t xml:space="preserve">├─ Software SIU                     | 1  | Lic | $0 | $0</w:t>
+        <w:t xml:space="preserve">├─ Software SIU (portal cautivo)    | 1  | Lic | $0 | $0</w:t>
       </w:r>
       <w:r>
         <w:br/>
       </w:r>
       <w:r>
+        <w:rPr>
+          <w:rStyle w:val="VerbatimChar"/>
+        </w:rPr>
+        <w:t xml:space="preserve">[NOTA: Pantallas LED paradero eliminadas — fuera de alcance]</w:t>
+      </w:r>
+      <w:r>
         <w:br/>
       </w:r>
       <w:r>
+        <w:br/>
+      </w:r>
+      <w:r>
         <w:rPr>
           <w:rStyle w:val="VerbatimChar"/>
         </w:rPr>
@@ -4859,7 +5022,7 @@
         <w:rPr>
           <w:rStyle w:val="VerbatimChar"/>
         </w:rPr>
-        <w:t xml:space="preserve">├─ Cámara CCTV interior            | 136| Und | $0 | $0</w:t>
+        <w:t xml:space="preserve">├─ Cámara CCTV interior bus            | 68 | Und | $0 | $0  [2 por bus]</w:t>
       </w:r>
       <w:r>
         <w:br/>
@@ -4868,7 +5031,7 @@
         <w:rPr>
           <w:rStyle w:val="VerbatimChar"/>
         </w:rPr>
-        <w:t xml:space="preserve">├─ Cámara CCTV exterior            | 68 | Und | $0 | $0</w:t>
+        <w:t xml:space="preserve">├─ Botón pánico bus                    | 68 | Und | $0 | $0  [2 por bus]</w:t>
       </w:r>
       <w:r>
         <w:br/>
@@ -4877,7 +5040,7 @@
         <w:rPr>
           <w:rStyle w:val="VerbatimChar"/>
         </w:rPr>
-        <w:t xml:space="preserve">├─ Botón pánico                     | 68 | Und | $0 | $0</w:t>
+        <w:t xml:space="preserve">├─ Grabador DVR/NVR SSD                | 34 | Und | $0 | $0</w:t>
       </w:r>
       <w:r>
         <w:br/>
@@ -4886,28 +5049,19 @@
         <w:rPr>
           <w:rStyle w:val="VerbatimChar"/>
         </w:rPr>
-        <w:t xml:space="preserve">├─ NVR                              | 34 | Und | $0 | $0</w:t>
+        <w:t xml:space="preserve">├─ Software SST                        | 1  | Lic | $0 | $0</w:t>
       </w:r>
       <w:r>
         <w:br/>
       </w:r>
       <w:r>
+        <w:br/>
+      </w:r>
+      <w:r>
         <w:rPr>
           <w:rStyle w:val="VerbatimChar"/>
         </w:rPr>
-        <w:t xml:space="preserve">├─ Software SST                     | 1  | Lic | $0 | $0</w:t>
-      </w:r>
-      <w:r>
-        <w:br/>
-      </w:r>
-      <w:r>
-        <w:br/>
-      </w:r>
-      <w:r>
-        <w:rPr>
-          <w:rStyle w:val="VerbatimChar"/>
-        </w:rPr>
-        <w:t xml:space="preserve">TOTAL GENERAL: $0</w:t>
+        <w:t xml:space="preserve">[NOTA: Equipamiento de paradero NO incluido en presupuesto ITS]</w:t>
       </w:r>
     </w:p>
     <w:p>
@@ -4937,7 +5091,7 @@
         <w:t xml:space="preserve"> </w:t>
       </w:r>
       <w:r>
-        <w:t xml:space="preserve">3. ❌ Sin cantidades confirmadas (basado en estimado 40 paraderos)</w:t>
+        <w:t xml:space="preserve">3. ❌ Sin cantidades confirmadas</w:t>
       </w:r>
       <w:r>
         <w:t xml:space="preserve"> </w:t>
@@ -4969,6 +5123,22 @@
       <w:r>
         <w:t xml:space="preserve">8. ❌ Sin contingencia (10-15%)</w:t>
       </w:r>
+      <w:r>
+        <w:t xml:space="preserve"> </w:t>
+      </w:r>
+      <w:r>
+        <w:t xml:space="preserve">9. ❌</w:t>
+      </w:r>
+      <w:r>
+        <w:t xml:space="preserve"> </w:t>
+      </w:r>
+      <w:r>
+        <w:rPr>
+          <w:bCs/>
+          <w:b/>
+        </w:rPr>
+        <w:t xml:space="preserve">Incluye pantallas LED paradero que están fuera del alcance de este proyecto</w:t>
+      </w:r>
     </w:p>
     <w:p>
       <w:pPr>
@@ -4985,7 +5155,25 @@
         <w:t xml:space="preserve"> </w:t>
       </w:r>
       <w:r>
-        <w:t xml:space="preserve">Este presupuesto no sirve para ningún propósito comercial, financiero, o de licitación.</w:t>
+        <w:t xml:space="preserve">Este presupuesto no sirve para ningún propósito comercial, financiero, o de licitación del componente ITS actual.</w:t>
+      </w:r>
+    </w:p>
+    <w:p>
+      <w:pPr>
+        <w:pStyle w:val="BodyText"/>
+      </w:pPr>
+      <w:r>
+        <w:rPr>
+          <w:bCs/>
+          <w:b/>
+        </w:rPr>
+        <w:t xml:space="preserve">Nota de Alcance:</w:t>
+      </w:r>
+      <w:r>
+        <w:t xml:space="preserve"> </w:t>
+      </w:r>
+      <w:r>
+        <w:t xml:space="preserve">Las cantidades de paraderos y sus pantallas LED se eliminan del análisis. El presupuesto ITS a diligenciar cubre exclusivamente: 34 buses equipados + CCO + conectividad.</w:t>
       </w:r>
     </w:p>
     <w:p>
@@ -5612,7 +5800,7 @@
               <w:jc w:val="left"/>
             </w:pPr>
             <w:r>
-              <w:t xml:space="preserve">Alta</w:t>
+              <w:t xml:space="preserve">Media</w:t>
             </w:r>
           </w:p>
         </w:tc>
@@ -5648,7 +5836,17 @@
               <w:jc w:val="left"/>
             </w:pPr>
             <w:r>
-              <w:t xml:space="preserve">Estudio eléctrico por paradero</w:t>
+              <w:rPr>
+                <w:bCs/>
+                <w:b/>
+              </w:rPr>
+              <w:t xml:space="preserve">Fuera de alcance actual</w:t>
+            </w:r>
+            <w:r>
+              <w:t xml:space="preserve"> </w:t>
+            </w:r>
+            <w:r>
+              <w:t xml:space="preserve">— Se abordará en fase de infraestructura</w:t>
             </w:r>
           </w:p>
         </w:tc>
@@ -5956,7 +6154,7 @@
         <w:t xml:space="preserve"> </w:t>
       </w:r>
       <w:r>
-        <w:t xml:space="preserve">— Estudio de mercado de precios unitarios</w:t>
+        <w:t xml:space="preserve">— Estudio de mercado de precios unitarios (excluyendo paraderos)</w:t>
       </w:r>
     </w:p>
     <w:p>
@@ -6010,7 +6208,7 @@
         <w:t xml:space="preserve"> </w:t>
       </w:r>
       <w:r>
-        <w:t xml:space="preserve">— Agregar ETP ITS detallado</w:t>
+        <w:t xml:space="preserve">— Agregar ETP ITS detallado (equipamiento embarcado + CCO + conectividad)</w:t>
       </w:r>
     </w:p>
     <w:p>
@@ -6032,7 +6230,7 @@
         <w:t xml:space="preserve"> </w:t>
       </w:r>
       <w:r>
-        <w:t xml:space="preserve">— Incluir preparación eléctrica/mecánica para ITS</w:t>
+        <w:t xml:space="preserve">— Incluir preparación eléctrica/mecánica para ITS embarcado</w:t>
       </w:r>
     </w:p>
     <w:p>
@@ -6067,8 +6265,7 @@
       </w:pPr>
       <w:r>
         <w:rPr>
-          <w:bCs/>
-          <w:b/>
+          <w:strike/>
         </w:rPr>
         <w:t xml:space="preserve">Definir número de paraderos</w:t>
       </w:r>
@@ -6076,7 +6273,23 @@
         <w:t xml:space="preserve"> </w:t>
       </w:r>
       <w:r>
-        <w:t xml:space="preserve">— Estudio de demanda por ruta</w:t>
+        <w:t xml:space="preserve">→</w:t>
+      </w:r>
+      <w:r>
+        <w:t xml:space="preserve"> </w:t>
+      </w:r>
+      <w:r>
+        <w:rPr>
+          <w:bCs/>
+          <w:b/>
+        </w:rPr>
+        <w:t xml:space="preserve">Postergado a fase de infraestructura</w:t>
+      </w:r>
+      <w:r>
+        <w:t xml:space="preserve"> </w:t>
+      </w:r>
+      <w:r>
+        <w:t xml:space="preserve">(fuera de alcance)</w:t>
       </w:r>
     </w:p>
     <w:bookmarkEnd w:id="58"/>
@@ -6731,19 +6944,44 @@
               <w:jc w:val="left"/>
             </w:pPr>
             <w:r>
-              <w:t xml:space="preserve">IC-07: Sin paraderos</w:t>
-            </w:r>
-          </w:p>
-        </w:tc>
-        <w:tc>
-          <w:tcPr/>
-          <w:p>
-            <w:pPr>
-              <w:pStyle w:val="Compact"/>
-              <w:jc w:val="left"/>
-            </w:pPr>
-            <w:r>
-              <w:t xml:space="preserve">🔴 Abierto</w:t>
+              <w:t xml:space="preserve">IC-07:</w:t>
+            </w:r>
+            <w:r>
+              <w:t xml:space="preserve"> </w:t>
+            </w:r>
+            <w:r>
+              <w:rPr>
+                <w:strike/>
+              </w:rPr>
+              <w:t xml:space="preserve">Sin paraderos</w:t>
+            </w:r>
+            <w:r>
+              <w:t xml:space="preserve"> </w:t>
+            </w:r>
+            <w:r>
+              <w:t xml:space="preserve">→</w:t>
+            </w:r>
+            <w:r>
+              <w:t xml:space="preserve"> </w:t>
+            </w:r>
+            <w:r>
+              <w:rPr>
+                <w:bCs/>
+                <w:b/>
+              </w:rPr>
+              <w:t xml:space="preserve">Paraderos fuera de alcance</w:t>
+            </w:r>
+          </w:p>
+        </w:tc>
+        <w:tc>
+          <w:tcPr/>
+          <w:p>
+            <w:pPr>
+              <w:pStyle w:val="Compact"/>
+              <w:jc w:val="left"/>
+            </w:pPr>
+            <w:r>
+              <w:t xml:space="preserve">🟢 Cerrado</w:t>
             </w:r>
           </w:p>
         </w:tc>
@@ -6767,19 +7005,19 @@
               <w:jc w:val="left"/>
             </w:pPr>
             <w:r>
-              <w:t xml:space="preserve">Por definir</w:t>
-            </w:r>
-          </w:p>
-        </w:tc>
-        <w:tc>
-          <w:tcPr/>
-          <w:p>
-            <w:pPr>
-              <w:pStyle w:val="Compact"/>
-              <w:jc w:val="left"/>
-            </w:pPr>
-            <w:r>
-              <w:t xml:space="preserve">—</w:t>
+              <w:t xml:space="preserve">N/A</w:t>
+            </w:r>
+          </w:p>
+        </w:tc>
+        <w:tc>
+          <w:tcPr/>
+          <w:p>
+            <w:pPr>
+              <w:pStyle w:val="Compact"/>
+              <w:jc w:val="left"/>
+            </w:pPr>
+            <w:r>
+              <w:t xml:space="preserve">Alcance confirmado: paraderos NO incluidos</w:t>
             </w:r>
           </w:p>
         </w:tc>
@@ -7105,17 +7343,25 @@
         <w:pStyle w:val="FirstParagraph"/>
       </w:pPr>
       <w:r>
-        <w:rPr>
-          <w:bCs/>
-          <w:b/>
-        </w:rPr>
-        <w:t xml:space="preserve">La estructuración técnica del componente ITS está en estado embrionario.</w:t>
-      </w:r>
-      <w:r>
-        <w:t xml:space="preserve"> </w:t>
-      </w:r>
-      <w:r>
-        <w:t xml:space="preserve">Se requiere trabajo significativo para alcanzar un nivel ejecutivo comparable al APP Chía-Girardot.</w:t>
+        <w:t xml:space="preserve">La estructuración técnica del componente ITS está en estado embrionario. Se requiere trabajo significativo para alcanzar un nivel ejecutivo comparable al APP Chía-Girardot.</w:t>
+      </w:r>
+    </w:p>
+    <w:p>
+      <w:pPr>
+        <w:pStyle w:val="BodyText"/>
+      </w:pPr>
+      <w:r>
+        <w:rPr>
+          <w:bCs/>
+          <w:b/>
+        </w:rPr>
+        <w:t xml:space="preserve">Alcance Confirmado de Este Documento:</w:t>
+      </w:r>
+      <w:r>
+        <w:t xml:space="preserve"> </w:t>
+      </w:r>
+      <w:r>
+        <w:t xml:space="preserve">El análisis cubre exclusivamente el componente tecnológico embarcado (buses + CCO + conectividad). Paraderos y EtB están fuera de alcance y se abordarán en fases posteriores del proyecto SETP.</w:t>
       </w:r>
     </w:p>
     <w:p>

</xml_diff>